<commit_message>
monitoreo cada 10 s y gráficos del dashboard con color
- Macro global {$LAGUNITAS.INTERVALO}=10s para todas las mediciones (ICMP,
  SNMP, API UniFi, prototipos LLD). Estáticos y descubrimientos conservan
  intervalos largos; disponibilidad 24 h/7 d cada 1 min.
- Trigger del controlador UniFi por tiempo (3m) en lugar de #3 muestras.
- Widgets con rf_rate=10 y refresco del frontend de los usuarios en 10 s.
- svggraph: en 7.0 el color de una lista de ítems va por ítem (ds.N.color.M);
  el color por serie se leía como '#1' y los trazos quedaban invisibles.
- Manual: sección 'Frecuencia de actualización'.

Co-Authored-By: Claude Opus 5.5 <noreply@anthropic.com>
</commit_message>
<xml_diff>
--- a/docs/Guia de implementacion - Red Las Lagunitas.docx
+++ b/docs/Guia de implementacion - Red Las Lagunitas.docx
@@ -1186,7 +1186,18 @@
         <w:t>Lagunitas - Disponibilidad ICMP</w:t>
       </w:r>
       <w:r>
-        <w:t>): el Zabbix server hace ping a cada equipo cada 30 s. Funciona con cualquier equipo con IP, incluidos los routers airCube de los hogares, que no tienen SNMP ni API documentada.</w:t>
+        <w:t xml:space="preserve">): el Zabbix server hace ping a cada equipo cada 10 s (macro global </w:t>
+      </w:r>
+      <w:r>
+        <w:rPr>
+          <w:rFonts w:ascii="Consolas" w:hAnsi="Consolas"/>
+          <w:color w:val="8A1C3A"/>
+          <w:sz w:val="18"/>
+        </w:rPr>
+        <w:t>{$LAGUNITAS.INTERVALO}</w:t>
+      </w:r>
+      <w:r>
+        <w:t>, igual que SNMP y la API de UniFi). Funciona con cualquier equipo con IP, incluidos los routers airCube de los hogares, que no tienen SNMP ni API documentada.</w:t>
       </w:r>
     </w:p>
     <w:p>

</xml_diff>

<commit_message>
alertas: Telegram listo para usar
- ensure_telegram: corrige la lectura de parámetros en 7.0 (output=extend),
  texto plano y plantillas en español (problema, resuelto, actualización).
- Comandos telegram-chat-id y probar-telegram.
- Guía de implementación y manual: procedimiento paso a paso.

Co-Authored-By: Claude Opus 5.5 <noreply@anthropic.com>
</commit_message>
<xml_diff>
--- a/docs/Guia de implementacion - Red Las Lagunitas.docx
+++ b/docs/Guia de implementacion - Red Las Lagunitas.docx
@@ -3926,7 +3926,7 @@
         <w:tab/>
       </w:r>
       <w:r>
-        <w:t xml:space="preserve">Crear un bot con </w:t>
+        <w:t xml:space="preserve">En Telegram, abrir </w:t>
       </w:r>
       <w:r>
         <w:rPr>
@@ -3935,7 +3935,7 @@
         <w:t>@BotFather</w:t>
       </w:r>
       <w:r>
-        <w:t xml:space="preserve"> (</w:t>
+        <w:t xml:space="preserve">, enviar </w:t>
       </w:r>
       <w:r>
         <w:rPr>
@@ -3946,7 +3946,36 @@
         <w:t>/newbot</w:t>
       </w:r>
       <w:r>
-        <w:t>) y copiar el token.</w:t>
+        <w:t xml:space="preserve">, elegir un nombre (por ejemplo </w:t>
+      </w:r>
+      <w:r>
+        <w:rPr>
+          <w:i/>
+        </w:rPr>
+        <w:t>Monitoreo Las Lagunitas</w:t>
+      </w:r>
+      <w:r>
+        <w:t xml:space="preserve">) y un usuario terminado en </w:t>
+      </w:r>
+      <w:r>
+        <w:rPr>
+          <w:rFonts w:ascii="Consolas" w:hAnsi="Consolas"/>
+          <w:color w:val="8A1C3A"/>
+          <w:sz w:val="18"/>
+        </w:rPr>
+        <w:t>bot</w:t>
+      </w:r>
+      <w:r>
+        <w:t xml:space="preserve">. BotFather responde con el </w:t>
+      </w:r>
+      <w:r>
+        <w:rPr>
+          <w:b/>
+        </w:rPr>
+        <w:t>token</w:t>
+      </w:r>
+      <w:r>
+        <w:t xml:space="preserve"> del bot.</w:t>
       </w:r>
     </w:p>
     <w:p>
@@ -3964,7 +3993,7 @@
         <w:tab/>
       </w:r>
       <w:r>
-        <w:t xml:space="preserve">Agregar el bot a un grupo de operadores y obtener el </w:t>
+        <w:t xml:space="preserve">Guardar el token en </w:t>
       </w:r>
       <w:r>
         <w:rPr>
@@ -3972,10 +4001,10 @@
           <w:color w:val="8A1C3A"/>
           <w:sz w:val="18"/>
         </w:rPr>
-        <w:t>chat_id</w:t>
-      </w:r>
-      <w:r>
-        <w:t xml:space="preserve"> (por ejemplo con </w:t>
+        <w:t>.env</w:t>
+      </w:r>
+      <w:r>
+        <w:t xml:space="preserve"> como </w:t>
       </w:r>
       <w:r>
         <w:rPr>
@@ -3983,10 +4012,10 @@
           <w:color w:val="8A1C3A"/>
           <w:sz w:val="18"/>
         </w:rPr>
-        <w:t>https://api.telegram.org/bot&lt;TOKEN&gt;/getUpdates</w:t>
-      </w:r>
-      <w:r>
-        <w:t xml:space="preserve"> después de escribir en el grupo).</w:t>
+        <w:t>TELEGRAM_BOT_TOKEN</w:t>
+      </w:r>
+      <w:r>
+        <w:t xml:space="preserve"> (editando el archivo; el token es un secreto y no debe pegarse en chats ni commits).</w:t>
       </w:r>
     </w:p>
     <w:p>
@@ -4004,7 +4033,35 @@
         <w:tab/>
       </w:r>
       <w:r>
-        <w:t xml:space="preserve">Completar </w:t>
+        <w:t xml:space="preserve">Crear un grupo de Telegram para los operadores, </w:t>
+      </w:r>
+      <w:r>
+        <w:rPr>
+          <w:b/>
+        </w:rPr>
+        <w:t>agregar el bot</w:t>
+      </w:r>
+      <w:r>
+        <w:t xml:space="preserve"> y escribir cualquier mensaje en el grupo. Obtener el identificador del chat:</w:t>
+      </w:r>
+    </w:p>
+    <w:p>
+      <w:pPr>
+        <w:spacing w:after="160"/>
+        <w:ind w:left="170"/>
+        <w:shd w:val="clear" w:color="auto" w:fill="F2F4F6"/>
+      </w:pPr>
+      <w:r>
+        <w:rPr>
+          <w:rFonts w:ascii="Consolas" w:hAnsi="Consolas" w:eastAsia="Consolas"/>
+          <w:sz w:val="17"/>
+        </w:rPr>
+        <w:t>bin/lagunitas telegram-chat-id</w:t>
+      </w:r>
+    </w:p>
+    <w:p>
+      <w:r>
+        <w:t xml:space="preserve">Muestra una línea </w:t>
       </w:r>
       <w:r>
         <w:rPr>
@@ -4012,10 +4069,10 @@
           <w:color w:val="8A1C3A"/>
           <w:sz w:val="18"/>
         </w:rPr>
-        <w:t>TELEGRAM_BOT_TOKEN</w:t>
-      </w:r>
-      <w:r>
-        <w:t xml:space="preserve"> y </w:t>
+        <w:t>TELEGRAM_CHAT_ID=...</w:t>
+      </w:r>
+      <w:r>
+        <w:t xml:space="preserve"> por cada chat (los grupos tienen ID negativo). Copiarla en </w:t>
       </w:r>
       <w:r>
         <w:rPr>
@@ -4023,29 +4080,7 @@
           <w:color w:val="8A1C3A"/>
           <w:sz w:val="18"/>
         </w:rPr>
-        <w:t>TELEGRAM_CHAT_ID</w:t>
-      </w:r>
-      <w:r>
-        <w:t xml:space="preserve"> en </w:t>
-      </w:r>
-      <w:r>
-        <w:rPr>
-          <w:rFonts w:ascii="Consolas" w:hAnsi="Consolas"/>
-          <w:color w:val="8A1C3A"/>
-          <w:sz w:val="18"/>
-        </w:rPr>
         <w:t>.env</w:t>
-      </w:r>
-      <w:r>
-        <w:t xml:space="preserve"> y ejecutar </w:t>
-      </w:r>
-      <w:r>
-        <w:rPr>
-          <w:rFonts w:ascii="Consolas" w:hAnsi="Consolas"/>
-          <w:color w:val="8A1C3A"/>
-          <w:sz w:val="18"/>
-        </w:rPr>
-        <w:t>bin/lagunitas aprovisionar --solo alertas</w:t>
       </w:r>
       <w:r>
         <w:t>.</w:t>
@@ -4066,16 +4101,48 @@
         <w:tab/>
       </w:r>
       <w:r>
-        <w:t xml:space="preserve">Probar desde </w:t>
+        <w:t>Configurar Zabbix y probar el envío:</w:t>
+      </w:r>
+    </w:p>
+    <w:p>
+      <w:pPr>
+        <w:spacing w:after="160"/>
+        <w:ind w:left="170"/>
+        <w:shd w:val="clear" w:color="auto" w:fill="F2F4F6"/>
+      </w:pPr>
+      <w:r>
+        <w:rPr>
+          <w:rFonts w:ascii="Consolas" w:hAnsi="Consolas" w:eastAsia="Consolas"/>
+          <w:sz w:val="17"/>
+        </w:rPr>
+        <w:t>bin/lagunitas aprovisionar --solo alertas</w:t>
+        <w:br/>
+        <w:t>bin/lagunitas probar-telegram</w:t>
+      </w:r>
+    </w:p>
+    <w:p>
+      <w:r>
+        <w:t xml:space="preserve">El aprovisionamiento habilita el media type </w:t>
       </w:r>
       <w:r>
         <w:rPr>
           <w:i/>
         </w:rPr>
-        <w:t>Alerts → Media types → Telegram → Test</w:t>
-      </w:r>
-      <w:r>
-        <w:t>.</w:t>
+        <w:t>Telegram</w:t>
+      </w:r>
+      <w:r>
+        <w:t xml:space="preserve"> con mensajes en español (🔴 problema, ✅ resuelto, 💬 actualización) y lo asigna al usuario </w:t>
+      </w:r>
+      <w:r>
+        <w:rPr>
+          <w:rFonts w:ascii="Consolas" w:hAnsi="Consolas"/>
+          <w:color w:val="8A1C3A"/>
+          <w:sz w:val="18"/>
+        </w:rPr>
+        <w:t>Admin</w:t>
+      </w:r>
+      <w:r>
+        <w:t xml:space="preserve"> para severidades Average, High y Disaster. En Telegram, cada "Resuelto" aparece como respuesta al mensaje del problema.</w:t>
       </w:r>
     </w:p>
     <w:p>

</xml_diff>

<commit_message>
alertas: Telegram al grupo de operadores, una sola alerta por caída troncal y bot de solo envío
- Detección escalonada: {$ICMP.CAIDA.PERIODO} = 90 s + 15 s por nivel de la
  topología, calculado desde el inventario (el padre siempre entra primero en
  problema y la dependencia suprime a los hijos; antes un hijo podía ganar la
  carrera y generar una alerta propia).
- Trigger de caída con dato operativo 'Caído'; mensajes sin número de evento.
- probar-telegram revisa la seguridad del bot (webhook, grupos, privacidad,
  comandos, permisos en el grupo).
- Documentación: seguridad del bot, revocación del token, escalonado.

Co-Authored-By: Claude Opus 5.5 <noreply@anthropic.com>
</commit_message>
<xml_diff>
--- a/docs/Guia de implementacion - Red Las Lagunitas.docx
+++ b/docs/Guia de implementacion - Red Las Lagunitas.docx
@@ -4143,6 +4143,715 @@
       </w:r>
       <w:r>
         <w:t xml:space="preserve"> para severidades Average, High y Disaster. En Telegram, cada "Resuelto" aparece como respuesta al mensaje del problema.</w:t>
+      </w:r>
+    </w:p>
+    <w:p>
+      <w:pPr>
+        <w:pStyle w:val="Heading3"/>
+        <w:jc w:val="left"/>
+      </w:pPr>
+      <w:r>
+        <w:rPr>
+          <w:rFonts w:ascii="Calibri" w:hAnsi="Calibri"/>
+          <w:color w:val="1F3A5F"/>
+          <w:sz w:val="25"/>
+        </w:rPr>
+        <w:t>Seguridad del bot de Telegram</w:t>
+      </w:r>
+    </w:p>
+    <w:p>
+      <w:r>
+        <w:rPr>
+          <w:b/>
+        </w:rPr>
+        <w:t>Modelo:</w:t>
+      </w:r>
+      <w:r>
+        <w:t xml:space="preserve"> el bot es de </w:t>
+      </w:r>
+      <w:r>
+        <w:rPr>
+          <w:b/>
+        </w:rPr>
+        <w:t>solo envío</w:t>
+      </w:r>
+      <w:r>
+        <w:t xml:space="preserve">. Zabbix llama por HTTPS saliente a </w:t>
+      </w:r>
+      <w:r>
+        <w:rPr>
+          <w:rFonts w:ascii="Consolas" w:hAnsi="Consolas"/>
+          <w:color w:val="8A1C3A"/>
+          <w:sz w:val="18"/>
+        </w:rPr>
+        <w:t>api.telegram.org</w:t>
+      </w:r>
+      <w:r>
+        <w:t xml:space="preserve"> con el token para publicar las alertas; no hay webhook, ni puerto abierto en el servidor, ni ningún programa que lea o ejecute lo que se le escriba al bot. Telegram no permite impedir que alguien le escriba al bot, pero esos mensajes no tienen ningún efecto: no llegan a Zabbix ni al servidor (Telegram los descarta a las 24 h). Por eso no es posible atacar Zabbix "a través del bot".</w:t>
+      </w:r>
+    </w:p>
+    <w:p>
+      <w:r>
+        <w:t>Lo que sí hay que proteger son dos cosas:</w:t>
+      </w:r>
+    </w:p>
+    <w:p>
+      <w:pPr>
+        <w:pStyle w:val="ListBullet"/>
+      </w:pPr>
+      <w:r>
+        <w:rPr>
+          <w:b/>
+        </w:rPr>
+        <w:t>El token.</w:t>
+      </w:r>
+      <w:r>
+        <w:t xml:space="preserve"> Quien lo tenga puede publicar mensajes como si fuera el bot (por ejemplo, alertas falsas en el grupo) y leer los mensajes que le hayan enviado. Vive solo en </w:t>
+      </w:r>
+      <w:r>
+        <w:rPr>
+          <w:rFonts w:ascii="Consolas" w:hAnsi="Consolas"/>
+          <w:color w:val="8A1C3A"/>
+          <w:sz w:val="18"/>
+        </w:rPr>
+        <w:t>.env</w:t>
+      </w:r>
+      <w:r>
+        <w:t xml:space="preserve"> (permisos 600, fuera de git) y en el media type de Zabbix (visible únicamente para Super admin). No pegarlo en chats, capturas ni commits.</w:t>
+      </w:r>
+    </w:p>
+    <w:p>
+      <w:pPr>
+        <w:pStyle w:val="ListBullet"/>
+      </w:pPr>
+      <w:r>
+        <w:rPr>
+          <w:b/>
+        </w:rPr>
+        <w:t>La cuenta de Telegram dueña del bot</w:t>
+      </w:r>
+      <w:r>
+        <w:t>, que es la que lo administra desde @BotFather.</w:t>
+      </w:r>
+    </w:p>
+    <w:p>
+      <w:r>
+        <w:t>Configuración recomendada (una sola vez, después de agregar el bot al grupo):</w:t>
+      </w:r>
+    </w:p>
+    <w:tbl>
+      <w:tblPr>
+        <w:tblStyle w:val="TableGrid"/>
+        <w:tblW w:type="auto" w:w="0"/>
+        <w:jc w:val="center"/>
+        <w:tblLook w:firstColumn="1" w:firstRow="1" w:lastColumn="0" w:lastRow="0" w:noHBand="0" w:noVBand="1" w:val="04A0"/>
+      </w:tblPr>
+      <w:tblGrid>
+        <w:gridCol w:w="3249"/>
+        <w:gridCol w:w="3249"/>
+        <w:gridCol w:w="3249"/>
+      </w:tblGrid>
+      <w:tr>
+        <w:tc>
+          <w:tcPr>
+            <w:tcW w:type="dxa" w:w="3249"/>
+            <w:shd w:val="clear" w:color="auto" w:fill="1F3A5F"/>
+          </w:tcPr>
+          <w:p>
+            <w:pPr>
+              <w:spacing w:after="40"/>
+            </w:pPr>
+            <w:r>
+              <w:rPr>
+                <w:b/>
+                <w:color w:val="FFFFFF"/>
+                <w:sz w:val="18"/>
+              </w:rPr>
+            </w:r>
+            <w:r>
+              <w:rPr>
+                <w:b/>
+                <w:color w:val="FFFFFF"/>
+                <w:sz w:val="18"/>
+              </w:rPr>
+              <w:t>Dónde</w:t>
+            </w:r>
+          </w:p>
+        </w:tc>
+        <w:tc>
+          <w:tcPr>
+            <w:tcW w:type="dxa" w:w="3249"/>
+            <w:shd w:val="clear" w:color="auto" w:fill="1F3A5F"/>
+          </w:tcPr>
+          <w:p>
+            <w:pPr>
+              <w:spacing w:after="40"/>
+            </w:pPr>
+            <w:r>
+              <w:rPr>
+                <w:b/>
+                <w:color w:val="FFFFFF"/>
+                <w:sz w:val="18"/>
+              </w:rPr>
+            </w:r>
+            <w:r>
+              <w:rPr>
+                <w:b/>
+                <w:color w:val="FFFFFF"/>
+                <w:sz w:val="18"/>
+              </w:rPr>
+              <w:t>Qué hacer</w:t>
+            </w:r>
+          </w:p>
+        </w:tc>
+        <w:tc>
+          <w:tcPr>
+            <w:tcW w:type="dxa" w:w="3249"/>
+            <w:shd w:val="clear" w:color="auto" w:fill="1F3A5F"/>
+          </w:tcPr>
+          <w:p>
+            <w:pPr>
+              <w:spacing w:after="40"/>
+            </w:pPr>
+            <w:r>
+              <w:rPr>
+                <w:b/>
+                <w:color w:val="FFFFFF"/>
+                <w:sz w:val="18"/>
+              </w:rPr>
+            </w:r>
+            <w:r>
+              <w:rPr>
+                <w:b/>
+                <w:color w:val="FFFFFF"/>
+                <w:sz w:val="18"/>
+              </w:rPr>
+              <w:t>Para qué</w:t>
+            </w:r>
+          </w:p>
+        </w:tc>
+      </w:tr>
+      <w:tr>
+        <w:tc>
+          <w:tcPr>
+            <w:tcW w:type="dxa" w:w="3249"/>
+          </w:tcPr>
+          <w:p>
+            <w:pPr>
+              <w:spacing w:after="40"/>
+            </w:pPr>
+            <w:r>
+              <w:rPr>
+                <w:sz w:val="18"/>
+              </w:rPr>
+            </w:r>
+            <w:r>
+              <w:rPr>
+                <w:sz w:val="18"/>
+              </w:rPr>
+              <w:t xml:space="preserve">@BotFather → </w:t>
+            </w:r>
+            <w:r>
+              <w:rPr>
+                <w:rFonts w:ascii="Consolas" w:hAnsi="Consolas"/>
+                <w:color w:val="8A1C3A"/>
+                <w:sz w:val="18"/>
+              </w:rPr>
+              <w:t>/setjoingroups</w:t>
+            </w:r>
+            <w:r>
+              <w:rPr>
+                <w:sz w:val="18"/>
+              </w:rPr>
+              <w:t xml:space="preserve"> → Disable</w:t>
+            </w:r>
+          </w:p>
+        </w:tc>
+        <w:tc>
+          <w:tcPr>
+            <w:tcW w:type="dxa" w:w="3249"/>
+          </w:tcPr>
+          <w:p>
+            <w:pPr>
+              <w:spacing w:after="40"/>
+            </w:pPr>
+            <w:r>
+              <w:rPr>
+                <w:sz w:val="18"/>
+              </w:rPr>
+            </w:r>
+            <w:r>
+              <w:rPr>
+                <w:sz w:val="18"/>
+              </w:rPr>
+              <w:t>Nadie puede agregar el bot a otros grupos</w:t>
+            </w:r>
+          </w:p>
+        </w:tc>
+        <w:tc>
+          <w:tcPr>
+            <w:tcW w:type="dxa" w:w="3249"/>
+          </w:tcPr>
+          <w:p>
+            <w:pPr>
+              <w:spacing w:after="40"/>
+            </w:pPr>
+            <w:r>
+              <w:rPr>
+                <w:sz w:val="18"/>
+              </w:rPr>
+            </w:r>
+            <w:r>
+              <w:rPr>
+                <w:sz w:val="18"/>
+              </w:rPr>
+              <w:t>Que no se use el bot fuera del grupo de operadores</w:t>
+            </w:r>
+          </w:p>
+        </w:tc>
+      </w:tr>
+      <w:tr>
+        <w:tc>
+          <w:tcPr>
+            <w:tcW w:type="dxa" w:w="3249"/>
+          </w:tcPr>
+          <w:p>
+            <w:pPr>
+              <w:spacing w:after="40"/>
+            </w:pPr>
+            <w:r>
+              <w:rPr>
+                <w:sz w:val="18"/>
+              </w:rPr>
+            </w:r>
+            <w:r>
+              <w:rPr>
+                <w:sz w:val="18"/>
+              </w:rPr>
+              <w:t xml:space="preserve">@BotFather → </w:t>
+            </w:r>
+            <w:r>
+              <w:rPr>
+                <w:rFonts w:ascii="Consolas" w:hAnsi="Consolas"/>
+                <w:color w:val="8A1C3A"/>
+                <w:sz w:val="18"/>
+              </w:rPr>
+              <w:t>/setprivacy</w:t>
+            </w:r>
+            <w:r>
+              <w:rPr>
+                <w:sz w:val="18"/>
+              </w:rPr>
+              <w:t xml:space="preserve"> → Enable (es el valor por defecto)</w:t>
+            </w:r>
+          </w:p>
+        </w:tc>
+        <w:tc>
+          <w:tcPr>
+            <w:tcW w:type="dxa" w:w="3249"/>
+          </w:tcPr>
+          <w:p>
+            <w:pPr>
+              <w:spacing w:after="40"/>
+            </w:pPr>
+            <w:r>
+              <w:rPr>
+                <w:sz w:val="18"/>
+              </w:rPr>
+            </w:r>
+            <w:r>
+              <w:rPr>
+                <w:sz w:val="18"/>
+              </w:rPr>
+              <w:t>El bot no lee los mensajes del grupo</w:t>
+            </w:r>
+          </w:p>
+        </w:tc>
+        <w:tc>
+          <w:tcPr>
+            <w:tcW w:type="dxa" w:w="3249"/>
+          </w:tcPr>
+          <w:p>
+            <w:pPr>
+              <w:spacing w:after="40"/>
+            </w:pPr>
+            <w:r>
+              <w:rPr>
+                <w:sz w:val="18"/>
+              </w:rPr>
+            </w:r>
+            <w:r>
+              <w:rPr>
+                <w:sz w:val="18"/>
+              </w:rPr>
+              <w:t>Que un token filtrado no exponga las conversaciones</w:t>
+            </w:r>
+          </w:p>
+        </w:tc>
+      </w:tr>
+      <w:tr>
+        <w:tc>
+          <w:tcPr>
+            <w:tcW w:type="dxa" w:w="3249"/>
+          </w:tcPr>
+          <w:p>
+            <w:pPr>
+              <w:spacing w:after="40"/>
+            </w:pPr>
+            <w:r>
+              <w:rPr>
+                <w:sz w:val="18"/>
+              </w:rPr>
+            </w:r>
+            <w:r>
+              <w:rPr>
+                <w:sz w:val="18"/>
+              </w:rPr>
+              <w:t>@BotFather</w:t>
+            </w:r>
+          </w:p>
+        </w:tc>
+        <w:tc>
+          <w:tcPr>
+            <w:tcW w:type="dxa" w:w="3249"/>
+          </w:tcPr>
+          <w:p>
+            <w:pPr>
+              <w:spacing w:after="40"/>
+            </w:pPr>
+            <w:r>
+              <w:rPr>
+                <w:sz w:val="18"/>
+              </w:rPr>
+            </w:r>
+            <w:r>
+              <w:rPr>
+                <w:sz w:val="18"/>
+              </w:rPr>
+              <w:t>No configurar comandos, modo inline ni webhook</w:t>
+            </w:r>
+          </w:p>
+        </w:tc>
+        <w:tc>
+          <w:tcPr>
+            <w:tcW w:type="dxa" w:w="3249"/>
+          </w:tcPr>
+          <w:p>
+            <w:pPr>
+              <w:spacing w:after="40"/>
+            </w:pPr>
+            <w:r>
+              <w:rPr>
+                <w:sz w:val="18"/>
+              </w:rPr>
+            </w:r>
+            <w:r>
+              <w:rPr>
+                <w:sz w:val="18"/>
+              </w:rPr>
+              <w:t>Que no haya nada que procese mensajes entrantes</w:t>
+            </w:r>
+          </w:p>
+        </w:tc>
+      </w:tr>
+      <w:tr>
+        <w:tc>
+          <w:tcPr>
+            <w:tcW w:type="dxa" w:w="3249"/>
+          </w:tcPr>
+          <w:p>
+            <w:pPr>
+              <w:spacing w:after="40"/>
+            </w:pPr>
+            <w:r>
+              <w:rPr>
+                <w:sz w:val="18"/>
+              </w:rPr>
+            </w:r>
+            <w:r>
+              <w:rPr>
+                <w:sz w:val="18"/>
+              </w:rPr>
+              <w:t>Grupo → Permisos</w:t>
+            </w:r>
+          </w:p>
+        </w:tc>
+        <w:tc>
+          <w:tcPr>
+            <w:tcW w:type="dxa" w:w="3249"/>
+          </w:tcPr>
+          <w:p>
+            <w:pPr>
+              <w:spacing w:after="40"/>
+            </w:pPr>
+            <w:r>
+              <w:rPr>
+                <w:sz w:val="18"/>
+              </w:rPr>
+            </w:r>
+            <w:r>
+              <w:rPr>
+                <w:sz w:val="18"/>
+              </w:rPr>
+              <w:t>"Agregar miembros": solo administradores; el bot como miembro común (no administrador)</w:t>
+            </w:r>
+          </w:p>
+        </w:tc>
+        <w:tc>
+          <w:tcPr>
+            <w:tcW w:type="dxa" w:w="3249"/>
+          </w:tcPr>
+          <w:p>
+            <w:pPr>
+              <w:spacing w:after="40"/>
+            </w:pPr>
+            <w:r>
+              <w:rPr>
+                <w:sz w:val="18"/>
+              </w:rPr>
+            </w:r>
+            <w:r>
+              <w:rPr>
+                <w:sz w:val="18"/>
+              </w:rPr>
+              <w:t>Controlar quién recibe las alertas</w:t>
+            </w:r>
+          </w:p>
+        </w:tc>
+      </w:tr>
+      <w:tr>
+        <w:tc>
+          <w:tcPr>
+            <w:tcW w:type="dxa" w:w="3249"/>
+          </w:tcPr>
+          <w:p>
+            <w:pPr>
+              <w:spacing w:after="40"/>
+            </w:pPr>
+            <w:r>
+              <w:rPr>
+                <w:sz w:val="18"/>
+              </w:rPr>
+            </w:r>
+            <w:r>
+              <w:rPr>
+                <w:sz w:val="18"/>
+              </w:rPr>
+              <w:t>Grupo → Enlaces de invitación</w:t>
+            </w:r>
+          </w:p>
+        </w:tc>
+        <w:tc>
+          <w:tcPr>
+            <w:tcW w:type="dxa" w:w="3249"/>
+          </w:tcPr>
+          <w:p>
+            <w:pPr>
+              <w:spacing w:after="40"/>
+            </w:pPr>
+            <w:r>
+              <w:rPr>
+                <w:sz w:val="18"/>
+              </w:rPr>
+            </w:r>
+            <w:r>
+              <w:rPr>
+                <w:sz w:val="18"/>
+              </w:rPr>
+              <w:t>Revocar los enlaces compartidos y usar invitaciones puntuales</w:t>
+            </w:r>
+          </w:p>
+        </w:tc>
+        <w:tc>
+          <w:tcPr>
+            <w:tcW w:type="dxa" w:w="3249"/>
+          </w:tcPr>
+          <w:p>
+            <w:pPr>
+              <w:spacing w:after="40"/>
+            </w:pPr>
+            <w:r>
+              <w:rPr>
+                <w:sz w:val="18"/>
+              </w:rPr>
+            </w:r>
+            <w:r>
+              <w:rPr>
+                <w:sz w:val="18"/>
+              </w:rPr>
+              <w:t>Que no entren desconocidos</w:t>
+            </w:r>
+          </w:p>
+        </w:tc>
+      </w:tr>
+      <w:tr>
+        <w:tc>
+          <w:tcPr>
+            <w:tcW w:type="dxa" w:w="3249"/>
+          </w:tcPr>
+          <w:p>
+            <w:pPr>
+              <w:spacing w:after="40"/>
+            </w:pPr>
+            <w:r>
+              <w:rPr>
+                <w:sz w:val="18"/>
+              </w:rPr>
+            </w:r>
+            <w:r>
+              <w:rPr>
+                <w:sz w:val="18"/>
+              </w:rPr>
+              <w:t>Telegram → Ajustes → Privacidad y seguridad</w:t>
+            </w:r>
+          </w:p>
+        </w:tc>
+        <w:tc>
+          <w:tcPr>
+            <w:tcW w:type="dxa" w:w="3249"/>
+          </w:tcPr>
+          <w:p>
+            <w:pPr>
+              <w:spacing w:after="40"/>
+            </w:pPr>
+            <w:r>
+              <w:rPr>
+                <w:sz w:val="18"/>
+              </w:rPr>
+            </w:r>
+            <w:r>
+              <w:rPr>
+                <w:sz w:val="18"/>
+              </w:rPr>
+              <w:t xml:space="preserve">Activar la </w:t>
+            </w:r>
+            <w:r>
+              <w:rPr>
+                <w:b/>
+                <w:sz w:val="18"/>
+              </w:rPr>
+              <w:t>verificación en dos pasos</w:t>
+            </w:r>
+            <w:r>
+              <w:rPr>
+                <w:sz w:val="18"/>
+              </w:rPr>
+              <w:t xml:space="preserve"> en la cuenta dueña del bot</w:t>
+            </w:r>
+          </w:p>
+        </w:tc>
+        <w:tc>
+          <w:tcPr>
+            <w:tcW w:type="dxa" w:w="3249"/>
+          </w:tcPr>
+          <w:p>
+            <w:pPr>
+              <w:spacing w:after="40"/>
+            </w:pPr>
+            <w:r>
+              <w:rPr>
+                <w:sz w:val="18"/>
+              </w:rPr>
+            </w:r>
+            <w:r>
+              <w:rPr>
+                <w:sz w:val="18"/>
+              </w:rPr>
+              <w:t>Que no se pueda tomar control del bot robando la cuenta</w:t>
+            </w:r>
+          </w:p>
+        </w:tc>
+      </w:tr>
+    </w:tbl>
+    <w:p/>
+    <w:p>
+      <w:r>
+        <w:t>Para comprobarlo en cualquier momento (envía un mensaje de prueba y revisa la configuración):</w:t>
+      </w:r>
+    </w:p>
+    <w:p>
+      <w:pPr>
+        <w:spacing w:after="160"/>
+        <w:ind w:left="170"/>
+        <w:shd w:val="clear" w:color="auto" w:fill="F2F4F6"/>
+      </w:pPr>
+      <w:r>
+        <w:rPr>
+          <w:rFonts w:ascii="Consolas" w:hAnsi="Consolas" w:eastAsia="Consolas"/>
+          <w:sz w:val="17"/>
+        </w:rPr>
+        <w:t>bin/lagunitas probar-telegram</w:t>
+      </w:r>
+    </w:p>
+    <w:p>
+      <w:r>
+        <w:t xml:space="preserve">Cada chequeo debe decir </w:t>
+      </w:r>
+      <w:r>
+        <w:rPr>
+          <w:rFonts w:ascii="Consolas" w:hAnsi="Consolas"/>
+          <w:color w:val="8A1C3A"/>
+          <w:sz w:val="18"/>
+        </w:rPr>
+        <w:t>OK</w:t>
+      </w:r>
+      <w:r>
+        <w:t xml:space="preserve">. Si el token se expuso (se pegó en un chat, apareció en una captura, alguien reporta mensajes extraños del bot): en @BotFather </w:t>
+      </w:r>
+      <w:r>
+        <w:rPr>
+          <w:rFonts w:ascii="Consolas" w:hAnsi="Consolas"/>
+          <w:color w:val="8A1C3A"/>
+          <w:sz w:val="18"/>
+        </w:rPr>
+        <w:t>/revoke</w:t>
+      </w:r>
+      <w:r>
+        <w:t xml:space="preserve"> → elegir el bot → copiar el token nuevo en </w:t>
+      </w:r>
+      <w:r>
+        <w:rPr>
+          <w:rFonts w:ascii="Consolas" w:hAnsi="Consolas"/>
+          <w:color w:val="8A1C3A"/>
+          <w:sz w:val="18"/>
+        </w:rPr>
+        <w:t>TELEGRAM_BOT_TOKEN</w:t>
+      </w:r>
+      <w:r>
+        <w:t xml:space="preserve"> de </w:t>
+      </w:r>
+      <w:r>
+        <w:rPr>
+          <w:rFonts w:ascii="Consolas" w:hAnsi="Consolas"/>
+          <w:color w:val="8A1C3A"/>
+          <w:sz w:val="18"/>
+        </w:rPr>
+        <w:t>.env</w:t>
+      </w:r>
+      <w:r>
+        <w:t xml:space="preserve"> → </w:t>
+      </w:r>
+      <w:r>
+        <w:rPr>
+          <w:rFonts w:ascii="Consolas" w:hAnsi="Consolas"/>
+          <w:color w:val="8A1C3A"/>
+          <w:sz w:val="18"/>
+        </w:rPr>
+        <w:t>bin/lagunitas aprovisionar --solo alertas</w:t>
+      </w:r>
+      <w:r>
+        <w:t xml:space="preserve"> → </w:t>
+      </w:r>
+      <w:r>
+        <w:rPr>
+          <w:rFonts w:ascii="Consolas" w:hAnsi="Consolas"/>
+          <w:color w:val="8A1C3A"/>
+          <w:sz w:val="18"/>
+        </w:rPr>
+        <w:t>bin/lagunitas probar-telegram</w:t>
+      </w:r>
+      <w:r>
+        <w:t>. El token anterior deja de funcionar en el acto.</w:t>
       </w:r>
     </w:p>
     <w:p>

</xml_diff>